<commit_message>
aggiunta personas, scenarios, target
</commit_message>
<xml_diff>
--- a/relazioneWeb.docx
+++ b/relazioneWeb.docx
@@ -2207,12 +2207,21 @@
           <w:szCs w:val="22"/>
         </w:rPr>
       </w:pPr>
-      <w:r>
-        <w:rPr>
-          <w:sz w:val="22"/>
-          <w:szCs w:val="22"/>
-        </w:rPr>
-        <w:t xml:space="preserve">Nella </w:t>
+      <w:proofErr w:type="spellStart"/>
+      <w:r>
+        <w:rPr>
+          <w:sz w:val="22"/>
+          <w:szCs w:val="22"/>
+        </w:rPr>
+        <w:t>Nella</w:t>
+      </w:r>
+      <w:proofErr w:type="spellEnd"/>
+      <w:r>
+        <w:rPr>
+          <w:sz w:val="22"/>
+          <w:szCs w:val="22"/>
+        </w:rPr>
+        <w:t xml:space="preserve"> </w:t>
       </w:r>
       <w:r>
         <w:rPr>
@@ -2490,12 +2499,21 @@
           <w:szCs w:val="22"/>
         </w:rPr>
       </w:pPr>
-      <w:r>
-        <w:rPr>
-          <w:sz w:val="22"/>
-          <w:szCs w:val="22"/>
-        </w:rPr>
-        <w:t>Per eff</w:t>
+      <w:proofErr w:type="spellStart"/>
+      <w:r>
+        <w:rPr>
+          <w:sz w:val="22"/>
+          <w:szCs w:val="22"/>
+        </w:rPr>
+        <w:t>Per</w:t>
+      </w:r>
+      <w:proofErr w:type="spellEnd"/>
+      <w:r>
+        <w:rPr>
+          <w:sz w:val="22"/>
+          <w:szCs w:val="22"/>
+        </w:rPr>
+        <w:t xml:space="preserve"> eff</w:t>
       </w:r>
       <w:r>
         <w:rPr>
@@ -3500,6 +3518,237 @@
         </w:rPr>
         <w:t>.</w:t>
       </w:r>
+      <w:r>
+        <w:rPr>
+          <w:sz w:val="22"/>
+          <w:szCs w:val="22"/>
+        </w:rPr>
+        <w:t xml:space="preserve"> </w:t>
+      </w:r>
+      <w:r>
+        <w:rPr>
+          <w:sz w:val="22"/>
+          <w:szCs w:val="22"/>
+        </w:rPr>
+        <w:t>Nella pagina</w:t>
+      </w:r>
+      <w:r>
+        <w:rPr>
+          <w:sz w:val="22"/>
+          <w:szCs w:val="22"/>
+        </w:rPr>
+        <w:t xml:space="preserve"> dedi</w:t>
+      </w:r>
+      <w:r>
+        <w:rPr>
+          <w:sz w:val="22"/>
+          <w:szCs w:val="22"/>
+        </w:rPr>
+        <w:t>cata a</w:t>
+      </w:r>
+      <w:r>
+        <w:rPr>
+          <w:sz w:val="22"/>
+          <w:szCs w:val="22"/>
+        </w:rPr>
+        <w:t>ll</w:t>
+      </w:r>
+      <w:r>
+        <w:rPr>
+          <w:sz w:val="22"/>
+          <w:szCs w:val="22"/>
+        </w:rPr>
+        <w:t>e pren</w:t>
+      </w:r>
+      <w:r>
+        <w:rPr>
+          <w:sz w:val="22"/>
+          <w:szCs w:val="22"/>
+        </w:rPr>
+        <w:t xml:space="preserve">otazioni </w:t>
+      </w:r>
+      <w:r>
+        <w:rPr>
+          <w:sz w:val="22"/>
+          <w:szCs w:val="22"/>
+        </w:rPr>
+        <w:t>potr</w:t>
+      </w:r>
+      <w:r>
+        <w:rPr>
+          <w:sz w:val="22"/>
+          <w:szCs w:val="22"/>
+        </w:rPr>
+        <w:t xml:space="preserve">à </w:t>
+      </w:r>
+      <w:r>
+        <w:rPr>
+          <w:sz w:val="22"/>
+          <w:szCs w:val="22"/>
+        </w:rPr>
+        <w:t>visua</w:t>
+      </w:r>
+      <w:r>
+        <w:rPr>
+          <w:sz w:val="22"/>
+          <w:szCs w:val="22"/>
+        </w:rPr>
+        <w:t>lizza</w:t>
+      </w:r>
+      <w:r>
+        <w:rPr>
+          <w:sz w:val="22"/>
+          <w:szCs w:val="22"/>
+        </w:rPr>
+        <w:t>re</w:t>
+      </w:r>
+      <w:r>
+        <w:rPr>
+          <w:sz w:val="22"/>
+          <w:szCs w:val="22"/>
+        </w:rPr>
+        <w:t xml:space="preserve">, </w:t>
+      </w:r>
+      <w:r>
+        <w:rPr>
+          <w:sz w:val="22"/>
+          <w:szCs w:val="22"/>
+        </w:rPr>
+        <w:t>ed e</w:t>
+      </w:r>
+      <w:r>
+        <w:rPr>
+          <w:sz w:val="22"/>
+          <w:szCs w:val="22"/>
+        </w:rPr>
+        <w:t>ven</w:t>
+      </w:r>
+      <w:r>
+        <w:rPr>
+          <w:sz w:val="22"/>
+          <w:szCs w:val="22"/>
+        </w:rPr>
+        <w:t>tual</w:t>
+      </w:r>
+      <w:r>
+        <w:rPr>
+          <w:sz w:val="22"/>
+          <w:szCs w:val="22"/>
+        </w:rPr>
+        <w:t>mente</w:t>
+      </w:r>
+      <w:r>
+        <w:rPr>
+          <w:sz w:val="22"/>
+          <w:szCs w:val="22"/>
+        </w:rPr>
+        <w:t xml:space="preserve"> elimina</w:t>
+      </w:r>
+      <w:r>
+        <w:rPr>
+          <w:sz w:val="22"/>
+          <w:szCs w:val="22"/>
+        </w:rPr>
+        <w:t>re</w:t>
+      </w:r>
+      <w:r>
+        <w:rPr>
+          <w:sz w:val="22"/>
+          <w:szCs w:val="22"/>
+        </w:rPr>
+        <w:t>,</w:t>
+      </w:r>
+      <w:r>
+        <w:rPr>
+          <w:sz w:val="22"/>
+          <w:szCs w:val="22"/>
+        </w:rPr>
+        <w:t xml:space="preserve"> </w:t>
+      </w:r>
+      <w:r>
+        <w:rPr>
+          <w:sz w:val="22"/>
+          <w:szCs w:val="22"/>
+        </w:rPr>
+        <w:t>l</w:t>
+      </w:r>
+      <w:r>
+        <w:rPr>
+          <w:sz w:val="22"/>
+          <w:szCs w:val="22"/>
+        </w:rPr>
+        <w:t>e preno</w:t>
+      </w:r>
+      <w:r>
+        <w:rPr>
+          <w:sz w:val="22"/>
+          <w:szCs w:val="22"/>
+        </w:rPr>
+        <w:t xml:space="preserve">tazioni </w:t>
+      </w:r>
+      <w:r>
+        <w:rPr>
+          <w:sz w:val="22"/>
+          <w:szCs w:val="22"/>
+        </w:rPr>
+        <w:t>degl</w:t>
+      </w:r>
+      <w:r>
+        <w:rPr>
+          <w:sz w:val="22"/>
+          <w:szCs w:val="22"/>
+        </w:rPr>
+        <w:t>i stude</w:t>
+      </w:r>
+      <w:r>
+        <w:rPr>
+          <w:sz w:val="22"/>
+          <w:szCs w:val="22"/>
+        </w:rPr>
+        <w:t xml:space="preserve">nti </w:t>
+      </w:r>
+      <w:r>
+        <w:rPr>
+          <w:sz w:val="22"/>
+          <w:szCs w:val="22"/>
+        </w:rPr>
+        <w:t>che s</w:t>
+      </w:r>
+      <w:r>
+        <w:rPr>
+          <w:sz w:val="22"/>
+          <w:szCs w:val="22"/>
+        </w:rPr>
+        <w:t>ono s</w:t>
+      </w:r>
+      <w:r>
+        <w:rPr>
+          <w:sz w:val="22"/>
+          <w:szCs w:val="22"/>
+        </w:rPr>
+        <w:t>tate</w:t>
+      </w:r>
+      <w:r>
+        <w:rPr>
+          <w:sz w:val="22"/>
+          <w:szCs w:val="22"/>
+        </w:rPr>
+        <w:t xml:space="preserve"> </w:t>
+      </w:r>
+      <w:r>
+        <w:rPr>
+          <w:sz w:val="22"/>
+          <w:szCs w:val="22"/>
+        </w:rPr>
+        <w:t>accettate</w:t>
+      </w:r>
+      <w:r>
+        <w:rPr>
+          <w:sz w:val="22"/>
+          <w:szCs w:val="22"/>
+        </w:rPr>
+        <w:t>.</w:t>
+      </w:r>
     </w:p>
     <w:p>
       <w:pPr>
@@ -3510,246 +3759,23 @@
           <w:szCs w:val="22"/>
         </w:rPr>
       </w:pPr>
-      <w:r>
-        <w:rPr>
-          <w:sz w:val="22"/>
-          <w:szCs w:val="22"/>
-        </w:rPr>
-        <w:t>Nella pagina</w:t>
-      </w:r>
-      <w:r>
-        <w:rPr>
-          <w:sz w:val="22"/>
-          <w:szCs w:val="22"/>
-        </w:rPr>
-        <w:t xml:space="preserve"> dedi</w:t>
-      </w:r>
-      <w:r>
-        <w:rPr>
-          <w:sz w:val="22"/>
-          <w:szCs w:val="22"/>
-        </w:rPr>
-        <w:t>cata a</w:t>
-      </w:r>
-      <w:r>
-        <w:rPr>
-          <w:sz w:val="22"/>
-          <w:szCs w:val="22"/>
-        </w:rPr>
-        <w:t>ll</w:t>
-      </w:r>
-      <w:r>
-        <w:rPr>
-          <w:sz w:val="22"/>
-          <w:szCs w:val="22"/>
-        </w:rPr>
-        <w:t>e pren</w:t>
-      </w:r>
-      <w:r>
-        <w:rPr>
-          <w:sz w:val="22"/>
-          <w:szCs w:val="22"/>
-        </w:rPr>
-        <w:t xml:space="preserve">otazioni </w:t>
-      </w:r>
-      <w:r>
-        <w:rPr>
-          <w:sz w:val="22"/>
-          <w:szCs w:val="22"/>
-        </w:rPr>
-        <w:t>potr</w:t>
-      </w:r>
-      <w:r>
-        <w:rPr>
-          <w:sz w:val="22"/>
-          <w:szCs w:val="22"/>
-        </w:rPr>
-        <w:t xml:space="preserve">à </w:t>
-      </w:r>
-      <w:r>
-        <w:rPr>
-          <w:sz w:val="22"/>
-          <w:szCs w:val="22"/>
-        </w:rPr>
-        <w:t>visua</w:t>
-      </w:r>
-      <w:r>
-        <w:rPr>
-          <w:sz w:val="22"/>
-          <w:szCs w:val="22"/>
-        </w:rPr>
-        <w:t>lizza</w:t>
-      </w:r>
-      <w:r>
-        <w:rPr>
-          <w:sz w:val="22"/>
-          <w:szCs w:val="22"/>
-        </w:rPr>
-        <w:t>re</w:t>
-      </w:r>
-      <w:r>
-        <w:rPr>
-          <w:sz w:val="22"/>
-          <w:szCs w:val="22"/>
-        </w:rPr>
-        <w:t xml:space="preserve">, </w:t>
-      </w:r>
-      <w:r>
-        <w:rPr>
-          <w:sz w:val="22"/>
-          <w:szCs w:val="22"/>
-        </w:rPr>
-        <w:t>ed e</w:t>
-      </w:r>
-      <w:r>
-        <w:rPr>
-          <w:sz w:val="22"/>
-          <w:szCs w:val="22"/>
-        </w:rPr>
-        <w:t>ven</w:t>
-      </w:r>
-      <w:r>
-        <w:rPr>
-          <w:sz w:val="22"/>
-          <w:szCs w:val="22"/>
-        </w:rPr>
-        <w:t>tual</w:t>
-      </w:r>
-      <w:r>
-        <w:rPr>
-          <w:sz w:val="22"/>
-          <w:szCs w:val="22"/>
-        </w:rPr>
-        <w:t>mente</w:t>
-      </w:r>
-      <w:r>
-        <w:rPr>
-          <w:sz w:val="22"/>
-          <w:szCs w:val="22"/>
-        </w:rPr>
-        <w:t xml:space="preserve"> elimina</w:t>
-      </w:r>
-      <w:r>
-        <w:rPr>
-          <w:sz w:val="22"/>
-          <w:szCs w:val="22"/>
-        </w:rPr>
-        <w:t>re</w:t>
-      </w:r>
+      <w:proofErr w:type="spellStart"/>
+      <w:proofErr w:type="gramStart"/>
+      <w:r>
+        <w:rPr>
+          <w:sz w:val="22"/>
+          <w:szCs w:val="22"/>
+        </w:rPr>
+        <w:t>Inoltre</w:t>
+      </w:r>
+      <w:proofErr w:type="spellEnd"/>
+      <w:proofErr w:type="gramEnd"/>
       <w:r>
         <w:rPr>
           <w:sz w:val="22"/>
           <w:szCs w:val="22"/>
         </w:rPr>
         <w:t>,</w:t>
-      </w:r>
-      <w:r>
-        <w:rPr>
-          <w:sz w:val="22"/>
-          <w:szCs w:val="22"/>
-        </w:rPr>
-        <w:t xml:space="preserve"> </w:t>
-      </w:r>
-      <w:r>
-        <w:rPr>
-          <w:sz w:val="22"/>
-          <w:szCs w:val="22"/>
-        </w:rPr>
-        <w:t>l</w:t>
-      </w:r>
-      <w:r>
-        <w:rPr>
-          <w:sz w:val="22"/>
-          <w:szCs w:val="22"/>
-        </w:rPr>
-        <w:t>e preno</w:t>
-      </w:r>
-      <w:r>
-        <w:rPr>
-          <w:sz w:val="22"/>
-          <w:szCs w:val="22"/>
-        </w:rPr>
-        <w:t xml:space="preserve">tazioni </w:t>
-      </w:r>
-      <w:r>
-        <w:rPr>
-          <w:sz w:val="22"/>
-          <w:szCs w:val="22"/>
-        </w:rPr>
-        <w:t>degl</w:t>
-      </w:r>
-      <w:r>
-        <w:rPr>
-          <w:sz w:val="22"/>
-          <w:szCs w:val="22"/>
-        </w:rPr>
-        <w:t>i stude</w:t>
-      </w:r>
-      <w:r>
-        <w:rPr>
-          <w:sz w:val="22"/>
-          <w:szCs w:val="22"/>
-        </w:rPr>
-        <w:t xml:space="preserve">nti </w:t>
-      </w:r>
-      <w:r>
-        <w:rPr>
-          <w:sz w:val="22"/>
-          <w:szCs w:val="22"/>
-        </w:rPr>
-        <w:t>che s</w:t>
-      </w:r>
-      <w:r>
-        <w:rPr>
-          <w:sz w:val="22"/>
-          <w:szCs w:val="22"/>
-        </w:rPr>
-        <w:t>ono s</w:t>
-      </w:r>
-      <w:r>
-        <w:rPr>
-          <w:sz w:val="22"/>
-          <w:szCs w:val="22"/>
-        </w:rPr>
-        <w:t>tate</w:t>
-      </w:r>
-      <w:r>
-        <w:rPr>
-          <w:sz w:val="22"/>
-          <w:szCs w:val="22"/>
-        </w:rPr>
-        <w:t xml:space="preserve"> </w:t>
-      </w:r>
-      <w:r>
-        <w:rPr>
-          <w:sz w:val="22"/>
-          <w:szCs w:val="22"/>
-        </w:rPr>
-        <w:t>accettate</w:t>
-      </w:r>
-      <w:r>
-        <w:rPr>
-          <w:sz w:val="22"/>
-          <w:szCs w:val="22"/>
-        </w:rPr>
-        <w:t>.</w:t>
-      </w:r>
-    </w:p>
-    <w:p>
-      <w:pPr>
-        <w:spacing w:after="0"/>
-        <w:jc w:val="both"/>
-        <w:rPr>
-          <w:sz w:val="22"/>
-          <w:szCs w:val="22"/>
-        </w:rPr>
-      </w:pPr>
-      <w:r>
-        <w:rPr>
-          <w:sz w:val="22"/>
-          <w:szCs w:val="22"/>
-        </w:rPr>
-        <w:t>Inoltre,</w:t>
       </w:r>
       <w:r>
         <w:rPr>
@@ -4100,6 +4126,7 @@
           <w:szCs w:val="22"/>
         </w:rPr>
       </w:pPr>
+      <w:bookmarkStart w:id="0" w:name="OLE_LINK1"/>
       <w:r>
         <w:rPr>
           <w:b/>
@@ -4178,6 +4205,7 @@
         </w:rPr>
         <w:t xml:space="preserve">dei </w:t>
       </w:r>
+      <w:proofErr w:type="spellStart"/>
       <w:r>
         <w:rPr>
           <w:sz w:val="22"/>
@@ -4185,6 +4213,7 @@
         </w:rPr>
         <w:t>mockup</w:t>
       </w:r>
+      <w:proofErr w:type="spellEnd"/>
       <w:r>
         <w:rPr>
           <w:sz w:val="22"/>
@@ -4225,8 +4254,33 @@
           <w:sz w:val="22"/>
           <w:szCs w:val="22"/>
         </w:rPr>
-        <w:t>identificazione di personas e scenarios</w:t>
-      </w:r>
+        <w:t xml:space="preserve">identificazione di </w:t>
+      </w:r>
+      <w:proofErr w:type="spellStart"/>
+      <w:r>
+        <w:rPr>
+          <w:sz w:val="22"/>
+          <w:szCs w:val="22"/>
+        </w:rPr>
+        <w:t>personas</w:t>
+      </w:r>
+      <w:proofErr w:type="spellEnd"/>
+      <w:r>
+        <w:rPr>
+          <w:sz w:val="22"/>
+          <w:szCs w:val="22"/>
+        </w:rPr>
+        <w:t xml:space="preserve"> e </w:t>
+      </w:r>
+      <w:proofErr w:type="spellStart"/>
+      <w:r>
+        <w:rPr>
+          <w:sz w:val="22"/>
+          <w:szCs w:val="22"/>
+        </w:rPr>
+        <w:t>scenarios</w:t>
+      </w:r>
+      <w:proofErr w:type="spellEnd"/>
       <w:r>
         <w:rPr>
           <w:sz w:val="22"/>
@@ -4260,7 +4314,15 @@
           <w:sz w:val="22"/>
           <w:szCs w:val="22"/>
         </w:rPr>
-        <w:t xml:space="preserve"> exp</w:t>
+        <w:t xml:space="preserve"> </w:t>
+      </w:r>
+      <w:proofErr w:type="spellStart"/>
+      <w:r>
+        <w:rPr>
+          <w:sz w:val="22"/>
+          <w:szCs w:val="22"/>
+        </w:rPr>
+        <w:t>exp</w:t>
       </w:r>
       <w:r>
         <w:rPr>
@@ -4276,6 +4338,7 @@
         </w:rPr>
         <w:t>ce</w:t>
       </w:r>
+      <w:proofErr w:type="spellEnd"/>
       <w:r>
         <w:rPr>
           <w:sz w:val="22"/>
@@ -4318,7 +4381,115 @@
         </w:rPr>
         <w:t>.</w:t>
       </w:r>
+      <w:r>
+        <w:rPr>
+          <w:sz w:val="22"/>
+          <w:szCs w:val="22"/>
+        </w:rPr>
+        <w:t xml:space="preserve"> Il target principale del sito sono gli studenti del campus di cesena. Per quanto riguarda le </w:t>
+      </w:r>
+      <w:proofErr w:type="spellStart"/>
+      <w:r>
+        <w:rPr>
+          <w:sz w:val="22"/>
+          <w:szCs w:val="22"/>
+        </w:rPr>
+        <w:t>personas</w:t>
+      </w:r>
+      <w:proofErr w:type="spellEnd"/>
+      <w:r>
+        <w:rPr>
+          <w:sz w:val="22"/>
+          <w:szCs w:val="22"/>
+        </w:rPr>
+        <w:t xml:space="preserve"> abbiamo individuato: Marco, 21 anni, iscritto al corso di Laurea Triennale in Ingegneria e Scienze Informatiche, cittadino di Cesena, Laura, 23 anni, studentessa di Architettura e Paola, 24 anni, st</w:t>
+      </w:r>
+      <w:r>
+        <w:rPr>
+          <w:sz w:val="22"/>
+          <w:szCs w:val="22"/>
+        </w:rPr>
+        <w:t>ud</w:t>
+      </w:r>
+      <w:r>
+        <w:rPr>
+          <w:sz w:val="22"/>
+          <w:szCs w:val="22"/>
+        </w:rPr>
+        <w:t>e</w:t>
+      </w:r>
+      <w:r>
+        <w:rPr>
+          <w:sz w:val="22"/>
+          <w:szCs w:val="22"/>
+        </w:rPr>
+        <w:t>n</w:t>
+      </w:r>
+      <w:r>
+        <w:rPr>
+          <w:sz w:val="22"/>
+          <w:szCs w:val="22"/>
+        </w:rPr>
+        <w:t xml:space="preserve">tessa </w:t>
+      </w:r>
+      <w:proofErr w:type="gramStart"/>
+      <w:r>
+        <w:rPr>
+          <w:sz w:val="22"/>
+          <w:szCs w:val="22"/>
+        </w:rPr>
+        <w:t>della Laura</w:t>
+      </w:r>
+      <w:proofErr w:type="gramEnd"/>
+      <w:r>
+        <w:rPr>
+          <w:sz w:val="22"/>
+          <w:szCs w:val="22"/>
+        </w:rPr>
+        <w:t xml:space="preserve"> Magistrale in Ingegneria Biomedica. </w:t>
+      </w:r>
     </w:p>
+    <w:p>
+      <w:pPr>
+        <w:spacing w:after="0"/>
+        <w:jc w:val="both"/>
+        <w:rPr>
+          <w:sz w:val="22"/>
+          <w:szCs w:val="22"/>
+        </w:rPr>
+      </w:pPr>
+      <w:proofErr w:type="spellStart"/>
+      <w:r>
+        <w:rPr>
+          <w:sz w:val="22"/>
+          <w:szCs w:val="22"/>
+        </w:rPr>
+        <w:t>Scenarios</w:t>
+      </w:r>
+      <w:proofErr w:type="spellEnd"/>
+      <w:r>
+        <w:rPr>
+          <w:sz w:val="22"/>
+          <w:szCs w:val="22"/>
+        </w:rPr>
+        <w:t xml:space="preserve">: lo studente vuole prenotare </w:t>
+      </w:r>
+      <w:r>
+        <w:rPr>
+          <w:sz w:val="22"/>
+          <w:szCs w:val="22"/>
+        </w:rPr>
+        <w:t>un’aula</w:t>
+      </w:r>
+      <w:r>
+        <w:rPr>
+          <w:sz w:val="22"/>
+          <w:szCs w:val="22"/>
+        </w:rPr>
+        <w:t xml:space="preserve"> per realizzare un progetto di gruppo e vuole vedere le disponibilità dal pc, lo studente deve mangiare e velocemente dal telefono vuole vedere se ci sono postazioni disponibili in polivalente o alcune aule sono disponibili. </w:t>
+      </w:r>
+    </w:p>
+    <w:bookmarkEnd w:id="0"/>
     <w:p>
       <w:pPr>
         <w:spacing w:after="0"/>
@@ -4338,369 +4509,388 @@
           <w:szCs w:val="22"/>
         </w:rPr>
       </w:pPr>
-      <w:r>
-        <w:rPr>
-          <w:b/>
-          <w:bCs/>
-          <w:sz w:val="22"/>
-          <w:szCs w:val="22"/>
-        </w:rPr>
-        <w:t>Test e revisione del design</w:t>
-      </w:r>
-      <w:r>
-        <w:rPr>
-          <w:sz w:val="22"/>
-          <w:szCs w:val="22"/>
-        </w:rPr>
-        <w:t>:</w:t>
-      </w:r>
-      <w:r>
-        <w:rPr>
-          <w:sz w:val="22"/>
-          <w:szCs w:val="22"/>
-        </w:rPr>
-        <w:t xml:space="preserve"> </w:t>
-      </w:r>
-      <w:r>
-        <w:rPr>
-          <w:sz w:val="22"/>
-          <w:szCs w:val="22"/>
-        </w:rPr>
-        <w:t>dopo</w:t>
-      </w:r>
-      <w:r>
-        <w:rPr>
-          <w:sz w:val="22"/>
-          <w:szCs w:val="22"/>
-        </w:rPr>
-        <w:t xml:space="preserve"> av</w:t>
-      </w:r>
-      <w:r>
-        <w:rPr>
-          <w:sz w:val="22"/>
-          <w:szCs w:val="22"/>
-        </w:rPr>
-        <w:t xml:space="preserve">er </w:t>
-      </w:r>
-      <w:r>
-        <w:rPr>
-          <w:sz w:val="22"/>
-          <w:szCs w:val="22"/>
-        </w:rPr>
-        <w:t>es</w:t>
-      </w:r>
-      <w:r>
-        <w:rPr>
-          <w:sz w:val="22"/>
-          <w:szCs w:val="22"/>
-        </w:rPr>
-        <w:t>eg</w:t>
-      </w:r>
-      <w:r>
-        <w:rPr>
-          <w:sz w:val="22"/>
-          <w:szCs w:val="22"/>
-        </w:rPr>
-        <w:t>uito</w:t>
-      </w:r>
-      <w:r>
-        <w:rPr>
-          <w:sz w:val="22"/>
-          <w:szCs w:val="22"/>
-        </w:rPr>
-        <w:t xml:space="preserve"> </w:t>
-      </w:r>
-      <w:r>
-        <w:rPr>
-          <w:sz w:val="22"/>
-          <w:szCs w:val="22"/>
-        </w:rPr>
-        <w:t>dive</w:t>
-      </w:r>
-      <w:r>
-        <w:rPr>
-          <w:sz w:val="22"/>
-          <w:szCs w:val="22"/>
-        </w:rPr>
-        <w:t xml:space="preserve">rsi </w:t>
-      </w:r>
-      <w:r>
-        <w:rPr>
-          <w:sz w:val="22"/>
-          <w:szCs w:val="22"/>
-        </w:rPr>
-        <w:t>te</w:t>
-      </w:r>
-      <w:r>
-        <w:rPr>
-          <w:sz w:val="22"/>
-          <w:szCs w:val="22"/>
-        </w:rPr>
-        <w:t>st</w:t>
-      </w:r>
-      <w:r>
-        <w:rPr>
-          <w:sz w:val="22"/>
-          <w:szCs w:val="22"/>
-        </w:rPr>
-        <w:t xml:space="preserve"> su</w:t>
-      </w:r>
-      <w:r>
-        <w:rPr>
-          <w:sz w:val="22"/>
-          <w:szCs w:val="22"/>
-        </w:rPr>
-        <w:t>l</w:t>
-      </w:r>
-      <w:r>
-        <w:rPr>
-          <w:sz w:val="22"/>
-          <w:szCs w:val="22"/>
-        </w:rPr>
-        <w:t xml:space="preserve"> gestio</w:t>
-      </w:r>
-      <w:r>
-        <w:rPr>
-          <w:sz w:val="22"/>
-          <w:szCs w:val="22"/>
-        </w:rPr>
-        <w:t xml:space="preserve">nale </w:t>
-      </w:r>
-      <w:r>
-        <w:rPr>
-          <w:sz w:val="22"/>
-          <w:szCs w:val="22"/>
-        </w:rPr>
-        <w:t>real</w:t>
-      </w:r>
-      <w:r>
-        <w:rPr>
-          <w:sz w:val="22"/>
-          <w:szCs w:val="22"/>
-        </w:rPr>
-        <w:t>izzato</w:t>
-      </w:r>
-      <w:r>
-        <w:rPr>
-          <w:sz w:val="22"/>
-          <w:szCs w:val="22"/>
-        </w:rPr>
-        <w:t xml:space="preserve">, </w:t>
-      </w:r>
-      <w:r>
-        <w:rPr>
-          <w:sz w:val="22"/>
-          <w:szCs w:val="22"/>
-        </w:rPr>
-        <w:t>sono</w:t>
-      </w:r>
-      <w:r>
-        <w:rPr>
-          <w:sz w:val="22"/>
-          <w:szCs w:val="22"/>
-        </w:rPr>
-        <w:t xml:space="preserve"> stat</w:t>
-      </w:r>
-      <w:r>
-        <w:rPr>
-          <w:sz w:val="22"/>
-          <w:szCs w:val="22"/>
-        </w:rPr>
-        <w:t xml:space="preserve">i </w:t>
-      </w:r>
-      <w:r>
-        <w:rPr>
-          <w:sz w:val="22"/>
-          <w:szCs w:val="22"/>
-        </w:rPr>
-        <w:t>fatti</w:t>
-      </w:r>
-      <w:r>
-        <w:rPr>
-          <w:sz w:val="22"/>
-          <w:szCs w:val="22"/>
-        </w:rPr>
-        <w:t xml:space="preserve"> </w:t>
-      </w:r>
-      <w:r>
-        <w:rPr>
-          <w:sz w:val="22"/>
-          <w:szCs w:val="22"/>
-        </w:rPr>
-        <w:t>alc</w:t>
-      </w:r>
-      <w:r>
-        <w:rPr>
-          <w:sz w:val="22"/>
-          <w:szCs w:val="22"/>
-        </w:rPr>
-        <w:t xml:space="preserve">uni </w:t>
-      </w:r>
-      <w:r>
-        <w:rPr>
-          <w:sz w:val="22"/>
-          <w:szCs w:val="22"/>
-        </w:rPr>
-        <w:t>cambiame</w:t>
-      </w:r>
-      <w:r>
-        <w:rPr>
-          <w:sz w:val="22"/>
-          <w:szCs w:val="22"/>
-        </w:rPr>
-        <w:t>nti</w:t>
-      </w:r>
-      <w:r>
-        <w:rPr>
-          <w:sz w:val="22"/>
-          <w:szCs w:val="22"/>
-        </w:rPr>
-        <w:t xml:space="preserve"> </w:t>
-      </w:r>
-      <w:r>
-        <w:rPr>
-          <w:sz w:val="22"/>
-          <w:szCs w:val="22"/>
-        </w:rPr>
-        <w:t>sul mock</w:t>
-      </w:r>
-      <w:r>
-        <w:rPr>
-          <w:sz w:val="22"/>
-          <w:szCs w:val="22"/>
-        </w:rPr>
-        <w:t>up</w:t>
-      </w:r>
-      <w:r>
-        <w:rPr>
-          <w:sz w:val="22"/>
-          <w:szCs w:val="22"/>
-        </w:rPr>
-        <w:t>,</w:t>
-      </w:r>
-      <w:r>
-        <w:rPr>
-          <w:sz w:val="22"/>
-          <w:szCs w:val="22"/>
-        </w:rPr>
-        <w:t xml:space="preserve"> </w:t>
-      </w:r>
-      <w:r>
-        <w:rPr>
-          <w:sz w:val="22"/>
-          <w:szCs w:val="22"/>
-        </w:rPr>
-        <w:t>in s</w:t>
-      </w:r>
-      <w:r>
-        <w:rPr>
-          <w:sz w:val="22"/>
-          <w:szCs w:val="22"/>
-        </w:rPr>
-        <w:t>egu</w:t>
-      </w:r>
-      <w:r>
-        <w:rPr>
-          <w:sz w:val="22"/>
-          <w:szCs w:val="22"/>
-        </w:rPr>
-        <w:t>ito</w:t>
-      </w:r>
-      <w:r>
-        <w:rPr>
-          <w:sz w:val="22"/>
-          <w:szCs w:val="22"/>
-        </w:rPr>
-        <w:t xml:space="preserve"> </w:t>
-      </w:r>
-      <w:r>
-        <w:rPr>
-          <w:sz w:val="22"/>
-          <w:szCs w:val="22"/>
-        </w:rPr>
-        <w:t>ad</w:t>
-      </w:r>
-      <w:r>
-        <w:rPr>
-          <w:sz w:val="22"/>
-          <w:szCs w:val="22"/>
-        </w:rPr>
-        <w:t xml:space="preserve"> una valutaz</w:t>
-      </w:r>
-      <w:r>
-        <w:rPr>
-          <w:sz w:val="22"/>
-          <w:szCs w:val="22"/>
-        </w:rPr>
-        <w:t>ione</w:t>
-      </w:r>
-      <w:r>
-        <w:rPr>
-          <w:sz w:val="22"/>
-          <w:szCs w:val="22"/>
-        </w:rPr>
-        <w:t xml:space="preserve"> com</w:t>
-      </w:r>
-      <w:r>
-        <w:rPr>
-          <w:sz w:val="22"/>
-          <w:szCs w:val="22"/>
-        </w:rPr>
-        <w:t>pi</w:t>
-      </w:r>
-      <w:r>
-        <w:rPr>
-          <w:sz w:val="22"/>
-          <w:szCs w:val="22"/>
-        </w:rPr>
-        <w:t>uta at</w:t>
-      </w:r>
-      <w:r>
-        <w:rPr>
-          <w:sz w:val="22"/>
-          <w:szCs w:val="22"/>
-        </w:rPr>
-        <w:t>traverso</w:t>
-      </w:r>
-      <w:r>
-        <w:rPr>
-          <w:sz w:val="22"/>
-          <w:szCs w:val="22"/>
-        </w:rPr>
-        <w:t xml:space="preserve"> f</w:t>
-      </w:r>
-      <w:r>
-        <w:rPr>
-          <w:sz w:val="22"/>
-          <w:szCs w:val="22"/>
-        </w:rPr>
-        <w:t>ocu</w:t>
-      </w:r>
-      <w:r>
-        <w:rPr>
-          <w:sz w:val="22"/>
-          <w:szCs w:val="22"/>
-        </w:rPr>
-        <w:t>s gr</w:t>
-      </w:r>
-      <w:r>
-        <w:rPr>
-          <w:sz w:val="22"/>
-          <w:szCs w:val="22"/>
-        </w:rPr>
-        <w:t>oup</w:t>
-      </w:r>
-      <w:r>
-        <w:rPr>
-          <w:sz w:val="22"/>
-          <w:szCs w:val="22"/>
-        </w:rPr>
-        <w:t>:</w:t>
-      </w:r>
     </w:p>
     <w:p>
       <w:pPr>
-        <w:pStyle w:val="ListParagraph"/>
+        <w:spacing w:after="0"/>
+        <w:jc w:val="both"/>
+        <w:rPr>
+          <w:sz w:val="22"/>
+          <w:szCs w:val="22"/>
+        </w:rPr>
+      </w:pPr>
+      <w:r>
+        <w:rPr>
+          <w:b/>
+          <w:bCs/>
+          <w:sz w:val="22"/>
+          <w:szCs w:val="22"/>
+        </w:rPr>
+        <w:t>Test e revisione del design</w:t>
+      </w:r>
+      <w:r>
+        <w:rPr>
+          <w:sz w:val="22"/>
+          <w:szCs w:val="22"/>
+        </w:rPr>
+        <w:t>:</w:t>
+      </w:r>
+      <w:r>
+        <w:rPr>
+          <w:sz w:val="22"/>
+          <w:szCs w:val="22"/>
+        </w:rPr>
+        <w:t xml:space="preserve"> </w:t>
+      </w:r>
+      <w:r>
+        <w:rPr>
+          <w:sz w:val="22"/>
+          <w:szCs w:val="22"/>
+        </w:rPr>
+        <w:t>dopo</w:t>
+      </w:r>
+      <w:r>
+        <w:rPr>
+          <w:sz w:val="22"/>
+          <w:szCs w:val="22"/>
+        </w:rPr>
+        <w:t xml:space="preserve"> av</w:t>
+      </w:r>
+      <w:r>
+        <w:rPr>
+          <w:sz w:val="22"/>
+          <w:szCs w:val="22"/>
+        </w:rPr>
+        <w:t xml:space="preserve">er </w:t>
+      </w:r>
+      <w:r>
+        <w:rPr>
+          <w:sz w:val="22"/>
+          <w:szCs w:val="22"/>
+        </w:rPr>
+        <w:t>es</w:t>
+      </w:r>
+      <w:r>
+        <w:rPr>
+          <w:sz w:val="22"/>
+          <w:szCs w:val="22"/>
+        </w:rPr>
+        <w:t>eg</w:t>
+      </w:r>
+      <w:r>
+        <w:rPr>
+          <w:sz w:val="22"/>
+          <w:szCs w:val="22"/>
+        </w:rPr>
+        <w:t>uito</w:t>
+      </w:r>
+      <w:r>
+        <w:rPr>
+          <w:sz w:val="22"/>
+          <w:szCs w:val="22"/>
+        </w:rPr>
+        <w:t xml:space="preserve"> </w:t>
+      </w:r>
+      <w:r>
+        <w:rPr>
+          <w:sz w:val="22"/>
+          <w:szCs w:val="22"/>
+        </w:rPr>
+        <w:t>dive</w:t>
+      </w:r>
+      <w:r>
+        <w:rPr>
+          <w:sz w:val="22"/>
+          <w:szCs w:val="22"/>
+        </w:rPr>
+        <w:t xml:space="preserve">rsi </w:t>
+      </w:r>
+      <w:r>
+        <w:rPr>
+          <w:sz w:val="22"/>
+          <w:szCs w:val="22"/>
+        </w:rPr>
+        <w:t>te</w:t>
+      </w:r>
+      <w:r>
+        <w:rPr>
+          <w:sz w:val="22"/>
+          <w:szCs w:val="22"/>
+        </w:rPr>
+        <w:t>st</w:t>
+      </w:r>
+      <w:r>
+        <w:rPr>
+          <w:sz w:val="22"/>
+          <w:szCs w:val="22"/>
+        </w:rPr>
+        <w:t xml:space="preserve"> su</w:t>
+      </w:r>
+      <w:r>
+        <w:rPr>
+          <w:sz w:val="22"/>
+          <w:szCs w:val="22"/>
+        </w:rPr>
+        <w:t>l</w:t>
+      </w:r>
+      <w:r>
+        <w:rPr>
+          <w:sz w:val="22"/>
+          <w:szCs w:val="22"/>
+        </w:rPr>
+        <w:t xml:space="preserve"> gestio</w:t>
+      </w:r>
+      <w:r>
+        <w:rPr>
+          <w:sz w:val="22"/>
+          <w:szCs w:val="22"/>
+        </w:rPr>
+        <w:t xml:space="preserve">nale </w:t>
+      </w:r>
+      <w:r>
+        <w:rPr>
+          <w:sz w:val="22"/>
+          <w:szCs w:val="22"/>
+        </w:rPr>
+        <w:t>real</w:t>
+      </w:r>
+      <w:r>
+        <w:rPr>
+          <w:sz w:val="22"/>
+          <w:szCs w:val="22"/>
+        </w:rPr>
+        <w:t>izzato</w:t>
+      </w:r>
+      <w:r>
+        <w:rPr>
+          <w:sz w:val="22"/>
+          <w:szCs w:val="22"/>
+        </w:rPr>
+        <w:t xml:space="preserve">, </w:t>
+      </w:r>
+      <w:r>
+        <w:rPr>
+          <w:sz w:val="22"/>
+          <w:szCs w:val="22"/>
+        </w:rPr>
+        <w:t>sono</w:t>
+      </w:r>
+      <w:r>
+        <w:rPr>
+          <w:sz w:val="22"/>
+          <w:szCs w:val="22"/>
+        </w:rPr>
+        <w:t xml:space="preserve"> stat</w:t>
+      </w:r>
+      <w:r>
+        <w:rPr>
+          <w:sz w:val="22"/>
+          <w:szCs w:val="22"/>
+        </w:rPr>
+        <w:t xml:space="preserve">i </w:t>
+      </w:r>
+      <w:r>
+        <w:rPr>
+          <w:sz w:val="22"/>
+          <w:szCs w:val="22"/>
+        </w:rPr>
+        <w:t>fatti</w:t>
+      </w:r>
+      <w:r>
+        <w:rPr>
+          <w:sz w:val="22"/>
+          <w:szCs w:val="22"/>
+        </w:rPr>
+        <w:t xml:space="preserve"> </w:t>
+      </w:r>
+      <w:r>
+        <w:rPr>
+          <w:sz w:val="22"/>
+          <w:szCs w:val="22"/>
+        </w:rPr>
+        <w:t>alc</w:t>
+      </w:r>
+      <w:r>
+        <w:rPr>
+          <w:sz w:val="22"/>
+          <w:szCs w:val="22"/>
+        </w:rPr>
+        <w:t xml:space="preserve">uni </w:t>
+      </w:r>
+      <w:r>
+        <w:rPr>
+          <w:sz w:val="22"/>
+          <w:szCs w:val="22"/>
+        </w:rPr>
+        <w:t>cambiame</w:t>
+      </w:r>
+      <w:r>
+        <w:rPr>
+          <w:sz w:val="22"/>
+          <w:szCs w:val="22"/>
+        </w:rPr>
+        <w:t>nti</w:t>
+      </w:r>
+      <w:r>
+        <w:rPr>
+          <w:sz w:val="22"/>
+          <w:szCs w:val="22"/>
+        </w:rPr>
+        <w:t xml:space="preserve"> </w:t>
+      </w:r>
+      <w:r>
+        <w:rPr>
+          <w:sz w:val="22"/>
+          <w:szCs w:val="22"/>
+        </w:rPr>
+        <w:t xml:space="preserve">sul </w:t>
+      </w:r>
+      <w:proofErr w:type="spellStart"/>
+      <w:r>
+        <w:rPr>
+          <w:sz w:val="22"/>
+          <w:szCs w:val="22"/>
+        </w:rPr>
+        <w:t>mock</w:t>
+      </w:r>
+      <w:r>
+        <w:rPr>
+          <w:sz w:val="22"/>
+          <w:szCs w:val="22"/>
+        </w:rPr>
+        <w:t>up</w:t>
+      </w:r>
+      <w:proofErr w:type="spellEnd"/>
+      <w:r>
+        <w:rPr>
+          <w:sz w:val="22"/>
+          <w:szCs w:val="22"/>
+        </w:rPr>
+        <w:t>,</w:t>
+      </w:r>
+      <w:r>
+        <w:rPr>
+          <w:sz w:val="22"/>
+          <w:szCs w:val="22"/>
+        </w:rPr>
+        <w:t xml:space="preserve"> </w:t>
+      </w:r>
+      <w:r>
+        <w:rPr>
+          <w:sz w:val="22"/>
+          <w:szCs w:val="22"/>
+        </w:rPr>
+        <w:t>in s</w:t>
+      </w:r>
+      <w:r>
+        <w:rPr>
+          <w:sz w:val="22"/>
+          <w:szCs w:val="22"/>
+        </w:rPr>
+        <w:t>egu</w:t>
+      </w:r>
+      <w:r>
+        <w:rPr>
+          <w:sz w:val="22"/>
+          <w:szCs w:val="22"/>
+        </w:rPr>
+        <w:t>ito</w:t>
+      </w:r>
+      <w:r>
+        <w:rPr>
+          <w:sz w:val="22"/>
+          <w:szCs w:val="22"/>
+        </w:rPr>
+        <w:t xml:space="preserve"> </w:t>
+      </w:r>
+      <w:r>
+        <w:rPr>
+          <w:sz w:val="22"/>
+          <w:szCs w:val="22"/>
+        </w:rPr>
+        <w:t>ad</w:t>
+      </w:r>
+      <w:r>
+        <w:rPr>
+          <w:sz w:val="22"/>
+          <w:szCs w:val="22"/>
+        </w:rPr>
+        <w:t xml:space="preserve"> una valutaz</w:t>
+      </w:r>
+      <w:r>
+        <w:rPr>
+          <w:sz w:val="22"/>
+          <w:szCs w:val="22"/>
+        </w:rPr>
+        <w:t>ione</w:t>
+      </w:r>
+      <w:r>
+        <w:rPr>
+          <w:sz w:val="22"/>
+          <w:szCs w:val="22"/>
+        </w:rPr>
+        <w:t xml:space="preserve"> com</w:t>
+      </w:r>
+      <w:r>
+        <w:rPr>
+          <w:sz w:val="22"/>
+          <w:szCs w:val="22"/>
+        </w:rPr>
+        <w:t>pi</w:t>
+      </w:r>
+      <w:r>
+        <w:rPr>
+          <w:sz w:val="22"/>
+          <w:szCs w:val="22"/>
+        </w:rPr>
+        <w:t>uta at</w:t>
+      </w:r>
+      <w:r>
+        <w:rPr>
+          <w:sz w:val="22"/>
+          <w:szCs w:val="22"/>
+        </w:rPr>
+        <w:t>traverso</w:t>
+      </w:r>
+      <w:r>
+        <w:rPr>
+          <w:sz w:val="22"/>
+          <w:szCs w:val="22"/>
+        </w:rPr>
+        <w:t xml:space="preserve"> f</w:t>
+      </w:r>
+      <w:r>
+        <w:rPr>
+          <w:sz w:val="22"/>
+          <w:szCs w:val="22"/>
+        </w:rPr>
+        <w:t>ocu</w:t>
+      </w:r>
+      <w:r>
+        <w:rPr>
+          <w:sz w:val="22"/>
+          <w:szCs w:val="22"/>
+        </w:rPr>
+        <w:t>s gr</w:t>
+      </w:r>
+      <w:r>
+        <w:rPr>
+          <w:sz w:val="22"/>
+          <w:szCs w:val="22"/>
+        </w:rPr>
+        <w:t>oup</w:t>
+      </w:r>
+      <w:r>
+        <w:rPr>
+          <w:sz w:val="22"/>
+          <w:szCs w:val="22"/>
+        </w:rPr>
+        <w:t>:</w:t>
+      </w:r>
+    </w:p>
+    <w:p>
+      <w:pPr>
+        <w:pStyle w:val="Paragrafoelenco"/>
         <w:numPr>
           <w:ilvl w:val="0"/>
           <w:numId w:val="1"/>
@@ -4717,6 +4907,7 @@
           <w:sz w:val="22"/>
           <w:szCs w:val="22"/>
         </w:rPr>
+        <w:lastRenderedPageBreak/>
         <w:t>A</w:t>
       </w:r>
       <w:r>
@@ -5037,7 +5228,7 @@
     </w:p>
     <w:p>
       <w:pPr>
-        <w:pStyle w:val="ListParagraph"/>
+        <w:pStyle w:val="Paragrafoelenco"/>
         <w:numPr>
           <w:ilvl w:val="0"/>
           <w:numId w:val="1"/>
@@ -5325,7 +5516,7 @@
     </w:p>
     <w:p>
       <w:pPr>
-        <w:pStyle w:val="ListParagraph"/>
+        <w:pStyle w:val="Paragrafoelenco"/>
         <w:numPr>
           <w:ilvl w:val="0"/>
           <w:numId w:val="1"/>
@@ -6307,14 +6498,14 @@
     <w:lsdException w:name="Unresolved Mention" w:semiHidden="1" w:unhideWhenUsed="1"/>
     <w:lsdException w:name="Smart Link" w:semiHidden="1" w:unhideWhenUsed="1"/>
   </w:latentStyles>
-  <w:style w:type="paragraph" w:default="1" w:styleId="Normal">
+  <w:style w:type="paragraph" w:default="1" w:styleId="Normale">
     <w:name w:val="Normal"/>
     <w:qFormat/>
   </w:style>
-  <w:style w:type="paragraph" w:styleId="Heading1">
+  <w:style w:type="paragraph" w:styleId="Titolo1">
     <w:name w:val="heading 1"/>
-    <w:basedOn w:val="Normal"/>
-    <w:next w:val="Normal"/>
+    <w:basedOn w:val="Normale"/>
+    <w:next w:val="Normale"/>
     <w:uiPriority w:val="9"/>
     <w:qFormat/>
     <w:rsid w:val="003152B1"/>
@@ -6331,10 +6522,10 @@
       <w:szCs w:val="40"/>
     </w:rPr>
   </w:style>
-  <w:style w:type="paragraph" w:styleId="Heading2">
+  <w:style w:type="paragraph" w:styleId="Titolo2">
     <w:name w:val="heading 2"/>
-    <w:basedOn w:val="Normal"/>
-    <w:next w:val="Normal"/>
+    <w:basedOn w:val="Normale"/>
+    <w:next w:val="Normale"/>
     <w:uiPriority w:val="9"/>
     <w:semiHidden/>
     <w:unhideWhenUsed/>
@@ -6353,10 +6544,10 @@
       <w:szCs w:val="32"/>
     </w:rPr>
   </w:style>
-  <w:style w:type="paragraph" w:styleId="Heading3">
+  <w:style w:type="paragraph" w:styleId="Titolo3">
     <w:name w:val="heading 3"/>
-    <w:basedOn w:val="Normal"/>
-    <w:next w:val="Normal"/>
+    <w:basedOn w:val="Normale"/>
+    <w:next w:val="Normale"/>
     <w:uiPriority w:val="9"/>
     <w:semiHidden/>
     <w:unhideWhenUsed/>
@@ -6375,10 +6566,10 @@
       <w:szCs w:val="28"/>
     </w:rPr>
   </w:style>
-  <w:style w:type="paragraph" w:styleId="Heading4">
+  <w:style w:type="paragraph" w:styleId="Titolo4">
     <w:name w:val="heading 4"/>
-    <w:basedOn w:val="Normal"/>
-    <w:next w:val="Normal"/>
+    <w:basedOn w:val="Normale"/>
+    <w:next w:val="Normale"/>
     <w:uiPriority w:val="9"/>
     <w:semiHidden/>
     <w:unhideWhenUsed/>
@@ -6397,10 +6588,10 @@
       <w:color w:val="0F4761" w:themeColor="accent1" w:themeShade="BF"/>
     </w:rPr>
   </w:style>
-  <w:style w:type="paragraph" w:styleId="Heading5">
+  <w:style w:type="paragraph" w:styleId="Titolo5">
     <w:name w:val="heading 5"/>
-    <w:basedOn w:val="Normal"/>
-    <w:next w:val="Normal"/>
+    <w:basedOn w:val="Normale"/>
+    <w:next w:val="Normale"/>
     <w:uiPriority w:val="9"/>
     <w:semiHidden/>
     <w:unhideWhenUsed/>
@@ -6417,10 +6608,10 @@
       <w:color w:val="0F4761" w:themeColor="accent1" w:themeShade="BF"/>
     </w:rPr>
   </w:style>
-  <w:style w:type="paragraph" w:styleId="Heading6">
+  <w:style w:type="paragraph" w:styleId="Titolo6">
     <w:name w:val="heading 6"/>
-    <w:basedOn w:val="Normal"/>
-    <w:next w:val="Normal"/>
+    <w:basedOn w:val="Normale"/>
+    <w:next w:val="Normale"/>
     <w:uiPriority w:val="9"/>
     <w:semiHidden/>
     <w:unhideWhenUsed/>
@@ -6439,10 +6630,10 @@
       <w:color w:val="595959" w:themeColor="text1" w:themeTint="A6"/>
     </w:rPr>
   </w:style>
-  <w:style w:type="paragraph" w:styleId="Heading7">
+  <w:style w:type="paragraph" w:styleId="Titolo7">
     <w:name w:val="heading 7"/>
-    <w:basedOn w:val="Normal"/>
-    <w:next w:val="Normal"/>
+    <w:basedOn w:val="Normale"/>
+    <w:next w:val="Normale"/>
     <w:uiPriority w:val="9"/>
     <w:semiHidden/>
     <w:unhideWhenUsed/>
@@ -6459,10 +6650,10 @@
       <w:color w:val="595959" w:themeColor="text1" w:themeTint="A6"/>
     </w:rPr>
   </w:style>
-  <w:style w:type="paragraph" w:styleId="Heading8">
+  <w:style w:type="paragraph" w:styleId="Titolo8">
     <w:name w:val="heading 8"/>
-    <w:basedOn w:val="Normal"/>
-    <w:next w:val="Normal"/>
+    <w:basedOn w:val="Normale"/>
+    <w:next w:val="Normale"/>
     <w:uiPriority w:val="9"/>
     <w:semiHidden/>
     <w:unhideWhenUsed/>
@@ -6481,10 +6672,10 @@
       <w:color w:val="272727" w:themeColor="text1" w:themeTint="D8"/>
     </w:rPr>
   </w:style>
-  <w:style w:type="paragraph" w:styleId="Heading9">
+  <w:style w:type="paragraph" w:styleId="Titolo9">
     <w:name w:val="heading 9"/>
-    <w:basedOn w:val="Normal"/>
-    <w:next w:val="Normal"/>
+    <w:basedOn w:val="Normale"/>
+    <w:next w:val="Normale"/>
     <w:uiPriority w:val="9"/>
     <w:semiHidden/>
     <w:unhideWhenUsed/>
@@ -6501,12 +6692,13 @@
       <w:color w:val="272727" w:themeColor="text1" w:themeTint="D8"/>
     </w:rPr>
   </w:style>
-  <w:style w:type="character" w:default="1" w:styleId="DefaultParagraphFont">
+  <w:style w:type="character" w:default="1" w:styleId="Carpredefinitoparagrafo">
     <w:name w:val="Default Paragraph Font"/>
     <w:uiPriority w:val="1"/>
+    <w:semiHidden/>
     <w:unhideWhenUsed/>
   </w:style>
-  <w:style w:type="table" w:default="1" w:styleId="TableNormal">
+  <w:style w:type="table" w:default="1" w:styleId="Tabellanormale">
     <w:name w:val="Normal Table"/>
     <w:uiPriority w:val="99"/>
     <w:semiHidden/>
@@ -6521,15 +6713,15 @@
       </w:tblCellMar>
     </w:tblPr>
   </w:style>
-  <w:style w:type="numbering" w:default="1" w:styleId="NoList">
+  <w:style w:type="numbering" w:default="1" w:styleId="Nessunelenco">
     <w:name w:val="No List"/>
     <w:uiPriority w:val="99"/>
     <w:semiHidden/>
     <w:unhideWhenUsed/>
   </w:style>
-  <w:style w:type="paragraph" w:styleId="ListParagraph">
+  <w:style w:type="paragraph" w:styleId="Paragrafoelenco">
     <w:name w:val="List Paragraph"/>
-    <w:basedOn w:val="Normal"/>
+    <w:basedOn w:val="Normale"/>
     <w:uiPriority w:val="34"/>
     <w:qFormat/>
     <w:rsid w:val="003152B1"/>
@@ -6538,9 +6730,9 @@
       <w:contextualSpacing/>
     </w:pPr>
   </w:style>
-  <w:style w:type="character" w:styleId="IntenseEmphasis">
+  <w:style w:type="character" w:styleId="Enfasiintensa">
     <w:name w:val="Intense Emphasis"/>
-    <w:basedOn w:val="DefaultParagraphFont"/>
+    <w:basedOn w:val="Carpredefinitoparagrafo"/>
     <w:uiPriority w:val="21"/>
     <w:qFormat/>
     <w:rsid w:val="003152B1"/>
@@ -6550,9 +6742,9 @@
       <w:color w:val="0F4761" w:themeColor="accent1" w:themeShade="BF"/>
     </w:rPr>
   </w:style>
-  <w:style w:type="character" w:styleId="IntenseReference">
+  <w:style w:type="character" w:styleId="Riferimentointenso">
     <w:name w:val="Intense Reference"/>
-    <w:basedOn w:val="DefaultParagraphFont"/>
+    <w:basedOn w:val="Carpredefinitoparagrafo"/>
     <w:uiPriority w:val="32"/>
     <w:qFormat/>
     <w:rsid w:val="003152B1"/>
@@ -6566,7 +6758,7 @@
   </w:style>
   <w:style w:type="character" w:customStyle="1" w:styleId="Titolo1Carattere">
     <w:name w:val="Titolo 1 Carattere"/>
-    <w:basedOn w:val="DefaultParagraphFont"/>
+    <w:basedOn w:val="Carpredefinitoparagrafo"/>
     <w:uiPriority w:val="9"/>
     <w:rsid w:val="005172CF"/>
     <w:rPr>
@@ -6578,7 +6770,7 @@
   </w:style>
   <w:style w:type="character" w:customStyle="1" w:styleId="Titolo2Carattere">
     <w:name w:val="Titolo 2 Carattere"/>
-    <w:basedOn w:val="DefaultParagraphFont"/>
+    <w:basedOn w:val="Carpredefinitoparagrafo"/>
     <w:uiPriority w:val="9"/>
     <w:semiHidden/>
     <w:rsid w:val="005172CF"/>
@@ -6591,7 +6783,7 @@
   </w:style>
   <w:style w:type="character" w:customStyle="1" w:styleId="Titolo3Carattere">
     <w:name w:val="Titolo 3 Carattere"/>
-    <w:basedOn w:val="DefaultParagraphFont"/>
+    <w:basedOn w:val="Carpredefinitoparagrafo"/>
     <w:uiPriority w:val="9"/>
     <w:semiHidden/>
     <w:rsid w:val="005172CF"/>
@@ -6604,7 +6796,7 @@
   </w:style>
   <w:style w:type="character" w:customStyle="1" w:styleId="Titolo4Carattere">
     <w:name w:val="Titolo 4 Carattere"/>
-    <w:basedOn w:val="DefaultParagraphFont"/>
+    <w:basedOn w:val="Carpredefinitoparagrafo"/>
     <w:uiPriority w:val="9"/>
     <w:semiHidden/>
     <w:rsid w:val="005172CF"/>
@@ -6617,7 +6809,7 @@
   </w:style>
   <w:style w:type="character" w:customStyle="1" w:styleId="Titolo5Carattere">
     <w:name w:val="Titolo 5 Carattere"/>
-    <w:basedOn w:val="DefaultParagraphFont"/>
+    <w:basedOn w:val="Carpredefinitoparagrafo"/>
     <w:uiPriority w:val="9"/>
     <w:semiHidden/>
     <w:rsid w:val="005172CF"/>
@@ -6628,7 +6820,7 @@
   </w:style>
   <w:style w:type="character" w:customStyle="1" w:styleId="Titolo6Carattere">
     <w:name w:val="Titolo 6 Carattere"/>
-    <w:basedOn w:val="DefaultParagraphFont"/>
+    <w:basedOn w:val="Carpredefinitoparagrafo"/>
     <w:uiPriority w:val="9"/>
     <w:semiHidden/>
     <w:rsid w:val="005172CF"/>
@@ -6641,7 +6833,7 @@
   </w:style>
   <w:style w:type="character" w:customStyle="1" w:styleId="Titolo7Carattere">
     <w:name w:val="Titolo 7 Carattere"/>
-    <w:basedOn w:val="DefaultParagraphFont"/>
+    <w:basedOn w:val="Carpredefinitoparagrafo"/>
     <w:uiPriority w:val="9"/>
     <w:semiHidden/>
     <w:rsid w:val="005172CF"/>
@@ -6652,7 +6844,7 @@
   </w:style>
   <w:style w:type="character" w:customStyle="1" w:styleId="Titolo8Carattere">
     <w:name w:val="Titolo 8 Carattere"/>
-    <w:basedOn w:val="DefaultParagraphFont"/>
+    <w:basedOn w:val="Carpredefinitoparagrafo"/>
     <w:uiPriority w:val="9"/>
     <w:semiHidden/>
     <w:rsid w:val="005172CF"/>
@@ -6665,7 +6857,7 @@
   </w:style>
   <w:style w:type="character" w:customStyle="1" w:styleId="Titolo9Carattere">
     <w:name w:val="Titolo 9 Carattere"/>
-    <w:basedOn w:val="DefaultParagraphFont"/>
+    <w:basedOn w:val="Carpredefinitoparagrafo"/>
     <w:uiPriority w:val="9"/>
     <w:semiHidden/>
     <w:rsid w:val="005172CF"/>
@@ -6676,7 +6868,7 @@
   </w:style>
   <w:style w:type="character" w:customStyle="1" w:styleId="TitoloCarattere">
     <w:name w:val="Titolo Carattere"/>
-    <w:basedOn w:val="DefaultParagraphFont"/>
+    <w:basedOn w:val="Carpredefinitoparagrafo"/>
     <w:uiPriority w:val="10"/>
     <w:rsid w:val="005172CF"/>
     <w:rPr>
@@ -6689,7 +6881,7 @@
   </w:style>
   <w:style w:type="character" w:customStyle="1" w:styleId="SottotitoloCarattere">
     <w:name w:val="Sottotitolo Carattere"/>
-    <w:basedOn w:val="DefaultParagraphFont"/>
+    <w:basedOn w:val="Carpredefinitoparagrafo"/>
     <w:uiPriority w:val="11"/>
     <w:rsid w:val="005172CF"/>
     <w:rPr>
@@ -6702,7 +6894,7 @@
   </w:style>
   <w:style w:type="character" w:customStyle="1" w:styleId="CitazioneCarattere">
     <w:name w:val="Citazione Carattere"/>
-    <w:basedOn w:val="DefaultParagraphFont"/>
+    <w:basedOn w:val="Carpredefinitoparagrafo"/>
     <w:uiPriority w:val="29"/>
     <w:rsid w:val="005172CF"/>
     <w:rPr>
@@ -6713,7 +6905,7 @@
   </w:style>
   <w:style w:type="character" w:customStyle="1" w:styleId="CitazioneintensaCarattere">
     <w:name w:val="Citazione intensa Carattere"/>
-    <w:basedOn w:val="DefaultParagraphFont"/>
+    <w:basedOn w:val="Carpredefinitoparagrafo"/>
     <w:uiPriority w:val="30"/>
     <w:rsid w:val="005172CF"/>
     <w:rPr>

</xml_diff>

<commit_message>
ho sistemato alcune cose nella relazione
</commit_message>
<xml_diff>
--- a/relazioneWeb.docx
+++ b/relazioneWeb.docx
@@ -2207,21 +2207,12 @@
           <w:szCs w:val="22"/>
         </w:rPr>
       </w:pPr>
-      <w:proofErr w:type="spellStart"/>
-      <w:r>
-        <w:rPr>
-          <w:sz w:val="22"/>
-          <w:szCs w:val="22"/>
-        </w:rPr>
-        <w:t>Nella</w:t>
-      </w:r>
-      <w:proofErr w:type="spellEnd"/>
-      <w:r>
-        <w:rPr>
-          <w:sz w:val="22"/>
-          <w:szCs w:val="22"/>
-        </w:rPr>
-        <w:t xml:space="preserve"> </w:t>
+      <w:r>
+        <w:rPr>
+          <w:sz w:val="22"/>
+          <w:szCs w:val="22"/>
+        </w:rPr>
+        <w:t xml:space="preserve">Nella </w:t>
       </w:r>
       <w:r>
         <w:rPr>
@@ -2499,21 +2490,12 @@
           <w:szCs w:val="22"/>
         </w:rPr>
       </w:pPr>
-      <w:proofErr w:type="spellStart"/>
-      <w:r>
-        <w:rPr>
-          <w:sz w:val="22"/>
-          <w:szCs w:val="22"/>
-        </w:rPr>
-        <w:t>Per</w:t>
-      </w:r>
-      <w:proofErr w:type="spellEnd"/>
-      <w:r>
-        <w:rPr>
-          <w:sz w:val="22"/>
-          <w:szCs w:val="22"/>
-        </w:rPr>
-        <w:t xml:space="preserve"> eff</w:t>
+      <w:r>
+        <w:rPr>
+          <w:sz w:val="22"/>
+          <w:szCs w:val="22"/>
+        </w:rPr>
+        <w:t>Per eff</w:t>
       </w:r>
       <w:r>
         <w:rPr>
@@ -3759,23 +3741,12 @@
           <w:szCs w:val="22"/>
         </w:rPr>
       </w:pPr>
-      <w:proofErr w:type="spellStart"/>
-      <w:proofErr w:type="gramStart"/>
-      <w:r>
-        <w:rPr>
-          <w:sz w:val="22"/>
-          <w:szCs w:val="22"/>
-        </w:rPr>
-        <w:t>Inoltre</w:t>
-      </w:r>
-      <w:proofErr w:type="spellEnd"/>
-      <w:proofErr w:type="gramEnd"/>
-      <w:r>
-        <w:rPr>
-          <w:sz w:val="22"/>
-          <w:szCs w:val="22"/>
-        </w:rPr>
-        <w:t>,</w:t>
+      <w:r>
+        <w:rPr>
+          <w:sz w:val="22"/>
+          <w:szCs w:val="22"/>
+        </w:rPr>
+        <w:t>Inoltre,</w:t>
       </w:r>
       <w:r>
         <w:rPr>
@@ -4205,7 +4176,6 @@
         </w:rPr>
         <w:t xml:space="preserve">dei </w:t>
       </w:r>
-      <w:proofErr w:type="spellStart"/>
       <w:r>
         <w:rPr>
           <w:sz w:val="22"/>
@@ -4213,7 +4183,6 @@
         </w:rPr>
         <w:t>mockup</w:t>
       </w:r>
-      <w:proofErr w:type="spellEnd"/>
       <w:r>
         <w:rPr>
           <w:sz w:val="22"/>
@@ -4254,33 +4223,8 @@
           <w:sz w:val="22"/>
           <w:szCs w:val="22"/>
         </w:rPr>
-        <w:t xml:space="preserve">identificazione di </w:t>
-      </w:r>
-      <w:proofErr w:type="spellStart"/>
-      <w:r>
-        <w:rPr>
-          <w:sz w:val="22"/>
-          <w:szCs w:val="22"/>
-        </w:rPr>
-        <w:t>personas</w:t>
-      </w:r>
-      <w:proofErr w:type="spellEnd"/>
-      <w:r>
-        <w:rPr>
-          <w:sz w:val="22"/>
-          <w:szCs w:val="22"/>
-        </w:rPr>
-        <w:t xml:space="preserve"> e </w:t>
-      </w:r>
-      <w:proofErr w:type="spellStart"/>
-      <w:r>
-        <w:rPr>
-          <w:sz w:val="22"/>
-          <w:szCs w:val="22"/>
-        </w:rPr>
-        <w:t>scenarios</w:t>
-      </w:r>
-      <w:proofErr w:type="spellEnd"/>
+        <w:t>identificazione di personas e scenarios</w:t>
+      </w:r>
       <w:r>
         <w:rPr>
           <w:sz w:val="22"/>
@@ -4314,15 +4258,7 @@
           <w:sz w:val="22"/>
           <w:szCs w:val="22"/>
         </w:rPr>
-        <w:t xml:space="preserve"> </w:t>
-      </w:r>
-      <w:proofErr w:type="spellStart"/>
-      <w:r>
-        <w:rPr>
-          <w:sz w:val="22"/>
-          <w:szCs w:val="22"/>
-        </w:rPr>
-        <w:t>exp</w:t>
+        <w:t xml:space="preserve"> exp</w:t>
       </w:r>
       <w:r>
         <w:rPr>
@@ -4338,7 +4274,6 @@
         </w:rPr>
         <w:t>ce</w:t>
       </w:r>
-      <w:proofErr w:type="spellEnd"/>
       <w:r>
         <w:rPr>
           <w:sz w:val="22"/>
@@ -4386,23 +4321,7 @@
           <w:sz w:val="22"/>
           <w:szCs w:val="22"/>
         </w:rPr>
-        <w:t xml:space="preserve"> Il target principale del sito sono gli studenti del campus di cesena. Per quanto riguarda le </w:t>
-      </w:r>
-      <w:proofErr w:type="spellStart"/>
-      <w:r>
-        <w:rPr>
-          <w:sz w:val="22"/>
-          <w:szCs w:val="22"/>
-        </w:rPr>
-        <w:t>personas</w:t>
-      </w:r>
-      <w:proofErr w:type="spellEnd"/>
-      <w:r>
-        <w:rPr>
-          <w:sz w:val="22"/>
-          <w:szCs w:val="22"/>
-        </w:rPr>
-        <w:t xml:space="preserve"> abbiamo individuato: Marco, 21 anni, iscritto al corso di Laurea Triennale in Ingegneria e Scienze Informatiche, cittadino di Cesena, Laura, 23 anni, studentessa di Architettura e Paola, 24 anni, st</w:t>
+        <w:t xml:space="preserve"> Il target principale del sito sono gli studenti del campus di cesena. Per quanto riguarda le personas abbiamo individuato: Marco, 21 anni, iscritto al corso di Laurea Triennale in Ingegneria e Scienze Informatiche, cittadino di Cesena, Laura, 23 anni, studentessa di Architettura e Paola, 24 anni, st</w:t>
       </w:r>
       <w:r>
         <w:rPr>
@@ -4430,23 +4349,7 @@
           <w:sz w:val="22"/>
           <w:szCs w:val="22"/>
         </w:rPr>
-        <w:t xml:space="preserve">tessa </w:t>
-      </w:r>
-      <w:proofErr w:type="gramStart"/>
-      <w:r>
-        <w:rPr>
-          <w:sz w:val="22"/>
-          <w:szCs w:val="22"/>
-        </w:rPr>
-        <w:t>della Laura</w:t>
-      </w:r>
-      <w:proofErr w:type="gramEnd"/>
-      <w:r>
-        <w:rPr>
-          <w:sz w:val="22"/>
-          <w:szCs w:val="22"/>
-        </w:rPr>
-        <w:t xml:space="preserve"> Magistrale in Ingegneria Biomedica. </w:t>
+        <w:t xml:space="preserve">tessa della Laura Magistrale in Ingegneria Biomedica. </w:t>
       </w:r>
     </w:p>
     <w:p>
@@ -4456,23 +4359,15 @@
         <w:rPr>
           <w:sz w:val="22"/>
           <w:szCs w:val="22"/>
+          <w:u w:val="single"/>
         </w:rPr>
       </w:pPr>
-      <w:proofErr w:type="spellStart"/>
-      <w:r>
-        <w:rPr>
-          <w:sz w:val="22"/>
-          <w:szCs w:val="22"/>
-        </w:rPr>
-        <w:t>Scenarios</w:t>
-      </w:r>
-      <w:proofErr w:type="spellEnd"/>
-      <w:r>
-        <w:rPr>
-          <w:sz w:val="22"/>
-          <w:szCs w:val="22"/>
-        </w:rPr>
-        <w:t xml:space="preserve">: lo studente vuole prenotare </w:t>
+      <w:r>
+        <w:rPr>
+          <w:sz w:val="22"/>
+          <w:szCs w:val="22"/>
+        </w:rPr>
+        <w:t xml:space="preserve">Scenarios: lo studente vuole prenotare </w:t>
       </w:r>
       <w:r>
         <w:rPr>
@@ -4486,7 +4381,14 @@
           <w:sz w:val="22"/>
           <w:szCs w:val="22"/>
         </w:rPr>
-        <w:t xml:space="preserve"> per realizzare un progetto di gruppo e vuole vedere le disponibilità dal pc, lo studente deve mangiare e velocemente dal telefono vuole vedere se ci sono postazioni disponibili in polivalente o alcune aule sono disponibili. </w:t>
+        <w:t xml:space="preserve"> per realizzare un progetto di gruppo e vuole vedere le disponibilità dal pc, lo studente deve mangiare e </w:t>
+      </w:r>
+      <w:r>
+        <w:rPr>
+          <w:sz w:val="22"/>
+          <w:szCs w:val="22"/>
+        </w:rPr>
+        <w:t>vuole vedere velocemente dal telefono se ci sono postazioni in Polivalente o aule disponibili.</w:t>
       </w:r>
     </w:p>
     <w:bookmarkEnd w:id="0"/>
@@ -4743,15 +4645,7 @@
           <w:sz w:val="22"/>
           <w:szCs w:val="22"/>
         </w:rPr>
-        <w:t xml:space="preserve">sul </w:t>
-      </w:r>
-      <w:proofErr w:type="spellStart"/>
-      <w:r>
-        <w:rPr>
-          <w:sz w:val="22"/>
-          <w:szCs w:val="22"/>
-        </w:rPr>
-        <w:t>mock</w:t>
+        <w:t>sul mock</w:t>
       </w:r>
       <w:r>
         <w:rPr>
@@ -4760,7 +4654,6 @@
         </w:rPr>
         <w:t>up</w:t>
       </w:r>
-      <w:proofErr w:type="spellEnd"/>
       <w:r>
         <w:rPr>
           <w:sz w:val="22"/>
@@ -5813,14 +5706,21 @@
           <w:sz w:val="22"/>
           <w:szCs w:val="22"/>
         </w:rPr>
-        <w:t>deciderl</w:t>
-      </w:r>
-      <w:r>
-        <w:rPr>
-          <w:sz w:val="22"/>
-          <w:szCs w:val="22"/>
-        </w:rPr>
-        <w:t xml:space="preserve">a se </w:t>
+        <w:t>decider</w:t>
+      </w:r>
+      <w:r>
+        <w:rPr>
+          <w:sz w:val="22"/>
+          <w:szCs w:val="22"/>
+        </w:rPr>
+        <w:t>e</w:t>
+      </w:r>
+      <w:r>
+        <w:rPr>
+          <w:sz w:val="22"/>
+          <w:szCs w:val="22"/>
+        </w:rPr>
+        <w:t xml:space="preserve"> se </w:t>
       </w:r>
       <w:r>
         <w:rPr>

</xml_diff>

<commit_message>
ho sistemato un tag nei form delle pagine per cercare aule e lab
</commit_message>
<xml_diff>
--- a/relazioneWeb.docx
+++ b/relazioneWeb.docx
@@ -4349,7 +4349,21 @@
           <w:sz w:val="22"/>
           <w:szCs w:val="22"/>
         </w:rPr>
-        <w:t xml:space="preserve">tessa della Laura Magistrale in Ingegneria Biomedica. </w:t>
+        <w:t>tessa della Laur</w:t>
+      </w:r>
+      <w:r>
+        <w:rPr>
+          <w:sz w:val="22"/>
+          <w:szCs w:val="22"/>
+        </w:rPr>
+        <w:t>e</w:t>
+      </w:r>
+      <w:r>
+        <w:rPr>
+          <w:sz w:val="22"/>
+          <w:szCs w:val="22"/>
+        </w:rPr>
+        <w:t xml:space="preserve">a Magistrale in Ingegneria Biomedica. </w:t>
       </w:r>
     </w:p>
     <w:p>

</xml_diff>

<commit_message>
ho riguardato la relazione
</commit_message>
<xml_diff>
--- a/relazioneWeb.docx
+++ b/relazioneWeb.docx
@@ -4176,6 +4176,7 @@
         </w:rPr>
         <w:t xml:space="preserve">dei </w:t>
       </w:r>
+      <w:proofErr w:type="spellStart"/>
       <w:r>
         <w:rPr>
           <w:sz w:val="22"/>
@@ -4183,6 +4184,7 @@
         </w:rPr>
         <w:t>mockup</w:t>
       </w:r>
+      <w:proofErr w:type="spellEnd"/>
       <w:r>
         <w:rPr>
           <w:sz w:val="22"/>
@@ -4223,8 +4225,33 @@
           <w:sz w:val="22"/>
           <w:szCs w:val="22"/>
         </w:rPr>
-        <w:t>identificazione di personas e scenarios</w:t>
-      </w:r>
+        <w:t xml:space="preserve">identificazione di </w:t>
+      </w:r>
+      <w:proofErr w:type="spellStart"/>
+      <w:r>
+        <w:rPr>
+          <w:sz w:val="22"/>
+          <w:szCs w:val="22"/>
+        </w:rPr>
+        <w:t>personas</w:t>
+      </w:r>
+      <w:proofErr w:type="spellEnd"/>
+      <w:r>
+        <w:rPr>
+          <w:sz w:val="22"/>
+          <w:szCs w:val="22"/>
+        </w:rPr>
+        <w:t xml:space="preserve"> e </w:t>
+      </w:r>
+      <w:proofErr w:type="spellStart"/>
+      <w:r>
+        <w:rPr>
+          <w:sz w:val="22"/>
+          <w:szCs w:val="22"/>
+        </w:rPr>
+        <w:t>scenarios</w:t>
+      </w:r>
+      <w:proofErr w:type="spellEnd"/>
       <w:r>
         <w:rPr>
           <w:sz w:val="22"/>
@@ -4258,7 +4285,15 @@
           <w:sz w:val="22"/>
           <w:szCs w:val="22"/>
         </w:rPr>
-        <w:t xml:space="preserve"> exp</w:t>
+        <w:t xml:space="preserve"> </w:t>
+      </w:r>
+      <w:proofErr w:type="spellStart"/>
+      <w:r>
+        <w:rPr>
+          <w:sz w:val="22"/>
+          <w:szCs w:val="22"/>
+        </w:rPr>
+        <w:t>exp</w:t>
       </w:r>
       <w:r>
         <w:rPr>
@@ -4274,6 +4309,7 @@
         </w:rPr>
         <w:t>ce</w:t>
       </w:r>
+      <w:proofErr w:type="spellEnd"/>
       <w:r>
         <w:rPr>
           <w:sz w:val="22"/>
@@ -4321,7 +4357,32 @@
           <w:sz w:val="22"/>
           <w:szCs w:val="22"/>
         </w:rPr>
-        <w:t xml:space="preserve"> Il target principale del sito sono gli studenti del campus di cesena. Per quanto riguarda le personas abbiamo individuato: Marco, 21 anni, iscritto al corso di Laurea Triennale in Ingegneria e Scienze Informatiche, cittadino di Cesena, Laura, 23 anni, studentessa di Architettura e Paola, 24 anni, st</w:t>
+        <w:t xml:space="preserve"> Il target principale del sito sono gli studenti del campus di cesena. Per quanto riguarda le </w:t>
+      </w:r>
+      <w:proofErr w:type="spellStart"/>
+      <w:r>
+        <w:rPr>
+          <w:sz w:val="22"/>
+          <w:szCs w:val="22"/>
+          <w:u w:val="single"/>
+        </w:rPr>
+        <w:t>P</w:t>
+      </w:r>
+      <w:r>
+        <w:rPr>
+          <w:sz w:val="22"/>
+          <w:szCs w:val="22"/>
+          <w:u w:val="single"/>
+        </w:rPr>
+        <w:t>ersonas</w:t>
+      </w:r>
+      <w:proofErr w:type="spellEnd"/>
+      <w:r>
+        <w:rPr>
+          <w:sz w:val="22"/>
+          <w:szCs w:val="22"/>
+        </w:rPr>
+        <w:t xml:space="preserve"> abbiamo individuato: Marco, 21 anni, iscritto al corso di Laurea Triennale in Ingegneria e Scienze Informatiche, cittadino di Cesena, Laura, 23 anni, studentessa di Architettura e Paola, 24 anni, st</w:t>
       </w:r>
       <w:r>
         <w:rPr>
@@ -4376,12 +4437,21 @@
           <w:u w:val="single"/>
         </w:rPr>
       </w:pPr>
-      <w:r>
-        <w:rPr>
-          <w:sz w:val="22"/>
-          <w:szCs w:val="22"/>
-        </w:rPr>
-        <w:t xml:space="preserve">Scenarios: lo studente vuole prenotare </w:t>
+      <w:proofErr w:type="spellStart"/>
+      <w:r>
+        <w:rPr>
+          <w:sz w:val="22"/>
+          <w:szCs w:val="22"/>
+        </w:rPr>
+        <w:t>Scenarios</w:t>
+      </w:r>
+      <w:proofErr w:type="spellEnd"/>
+      <w:r>
+        <w:rPr>
+          <w:sz w:val="22"/>
+          <w:szCs w:val="22"/>
+        </w:rPr>
+        <w:t xml:space="preserve">: lo studente vuole prenotare </w:t>
       </w:r>
       <w:r>
         <w:rPr>
@@ -4659,7 +4729,15 @@
           <w:sz w:val="22"/>
           <w:szCs w:val="22"/>
         </w:rPr>
-        <w:t>sul mock</w:t>
+        <w:t xml:space="preserve">sul </w:t>
+      </w:r>
+      <w:proofErr w:type="spellStart"/>
+      <w:r>
+        <w:rPr>
+          <w:sz w:val="22"/>
+          <w:szCs w:val="22"/>
+        </w:rPr>
+        <w:t>mock</w:t>
       </w:r>
       <w:r>
         <w:rPr>
@@ -4668,6 +4746,7 @@
         </w:rPr>
         <w:t>up</w:t>
       </w:r>
+      <w:proofErr w:type="spellEnd"/>
       <w:r>
         <w:rPr>
           <w:sz w:val="22"/>

</xml_diff>